<commit_message>
Actualizar documentos y evidencias del proyecto
</commit_message>
<xml_diff>
--- a/docs/QA_Alcance_Calidad_Orange.docx
+++ b/docs/QA_Alcance_Calidad_Orange.docx
@@ -275,13 +275,7 @@
               <w:rPr>
                 <w:lang w:val="es-PE"/>
               </w:rPr>
-              <w:t>10</w:t>
-            </w:r>
-            <w:r>
-              <w:rPr>
-                <w:lang w:val="es-PE"/>
-              </w:rPr>
-              <w:t>-oct-2026</w:t>
+              <w:t>10-oct-2026</w:t>
             </w:r>
           </w:p>
         </w:tc>
@@ -321,13 +315,7 @@
               <w:rPr>
                 <w:lang w:val="es-PE"/>
               </w:rPr>
-              <w:t>Mariana Ramon Vitteri</w:t>
-            </w:r>
-            <w:r>
-              <w:rPr>
-                <w:lang w:val="es-PE"/>
-              </w:rPr>
-              <w:t xml:space="preserve"> (QA)</w:t>
+              <w:t>Mariana Ramon Vitteri (QA)</w:t>
             </w:r>
           </w:p>
         </w:tc>
@@ -687,13 +675,7 @@
               <w:rPr>
                 <w:lang w:val="es-PE"/>
               </w:rPr>
-              <w:t>10</w:t>
-            </w:r>
-            <w:r>
-              <w:rPr>
-                <w:lang w:val="es-PE"/>
-              </w:rPr>
-              <w:t>-oct-2026</w:t>
+              <w:t>10-oct-2026</w:t>
             </w:r>
           </w:p>
         </w:tc>
@@ -1002,15 +984,28 @@
                 <w:lang w:val="es-PE"/>
               </w:rPr>
             </w:pPr>
-            <w:hyperlink r:id="rId5" w:history="1">
-              <w:r>
-                <w:rPr>
-                  <w:rStyle w:val="Hipervnculo"/>
-                  <w:lang w:val="es-PE"/>
-                </w:rPr>
-                <w:t>https://opensource-demo.orangehrmlive.com/web/index.php/auth/login</w:t>
-              </w:r>
-            </w:hyperlink>
+            <w:r>
+              <w:fldChar w:fldCharType="begin"/>
+            </w:r>
+            <w:r>
+              <w:rPr>
+                <w:lang w:val="es-PE"/>
+              </w:rPr>
+              <w:instrText>HYPERLINK "https://opensource-demo.orangehrmlive.com/web/index.php/auth/login"</w:instrText>
+            </w:r>
+            <w:r>
+              <w:fldChar w:fldCharType="separate"/>
+            </w:r>
+            <w:r>
+              <w:rPr>
+                <w:rStyle w:val="Hipervnculo"/>
+                <w:lang w:val="es-PE"/>
+              </w:rPr>
+              <w:t>https://opensource-demo.orangehrmlive.com/web/index.php/auth/login</w:t>
+            </w:r>
+            <w:r>
+              <w:fldChar w:fldCharType="end"/>
+            </w:r>
           </w:p>
         </w:tc>
       </w:tr>
@@ -2843,23 +2838,7 @@
           <w:sz w:val="20"/>
           <w:lang w:val="es-PE"/>
         </w:rPr>
-        <w:t>Orange</w:t>
-      </w:r>
-      <w:r>
-        <w:rPr>
-          <w:color w:val="000000"/>
-          <w:sz w:val="20"/>
-          <w:lang w:val="es-PE"/>
-        </w:rPr>
-        <w:t xml:space="preserve"> </w:t>
-      </w:r>
-      <w:r>
-        <w:rPr>
-          <w:color w:val="000000"/>
-          <w:sz w:val="20"/>
-          <w:lang w:val="es-PE"/>
-        </w:rPr>
-        <w:t>HRM</w:t>
+        <w:t>Orange HRM</w:t>
       </w:r>
       <w:r>
         <w:rPr>
@@ -3196,14 +3175,7 @@
                 <w:szCs w:val="24"/>
                 <w:lang w:val="es-PE"/>
               </w:rPr>
-              <w:t xml:space="preserve">Aceptación </w:t>
-            </w:r>
-            <w:r>
-              <w:rPr>
-                <w:szCs w:val="24"/>
-                <w:lang w:val="es-PE"/>
-              </w:rPr>
-              <w:t>simulada</w:t>
+              <w:t>Aceptación simulada</w:t>
             </w:r>
           </w:p>
         </w:tc>
@@ -3645,28 +3617,16 @@
           <w:p>
             <w:pPr>
               <w:spacing w:after="0" w:line="276" w:lineRule="auto"/>
-              <w:rPr>
-                <w:lang w:val="es-PE"/>
-              </w:rPr>
-            </w:pPr>
-            <w:r>
-              <w:rPr>
-                <w:lang w:val="es-PE"/>
-              </w:rPr>
+            </w:pPr>
+            <w:r>
               <w:t xml:space="preserve">Orange HRM </w:t>
             </w:r>
           </w:p>
           <w:p>
             <w:pPr>
               <w:spacing w:after="0" w:line="276" w:lineRule="auto"/>
-              <w:rPr>
-                <w:lang w:val="es-PE"/>
-              </w:rPr>
-            </w:pPr>
-            <w:r>
-              <w:rPr>
-                <w:lang w:val="es-PE"/>
-              </w:rPr>
+            </w:pPr>
+            <w:r>
               <w:t>https://opensource-demo.orangehrmlive.com/web/index.php/auth/login</w:t>
             </w:r>
           </w:p>
@@ -6094,6 +6054,33 @@
           <w:lang w:val="es-PE"/>
         </w:rPr>
       </w:pPr>
+      <w:hyperlink r:id="rId5" w:history="1">
+        <w:r>
+          <w:rPr>
+            <w:rStyle w:val="Hipervnculo"/>
+            <w:lang w:val="es-PE"/>
+          </w:rPr>
+          <w:t>https://opensource-demo.orangehrmlive.com/web/index.php/auth/login</w:t>
+        </w:r>
+      </w:hyperlink>
+      <w:r>
+        <w:rPr>
+          <w:lang w:val="es-PE"/>
+        </w:rPr>
+        <w:t xml:space="preserve"> aplicación bajo prueba.</w:t>
+      </w:r>
+    </w:p>
+    <w:p>
+      <w:pPr>
+        <w:pStyle w:val="Prrafodelista"/>
+        <w:numPr>
+          <w:ilvl w:val="0"/>
+          <w:numId w:val="13"/>
+        </w:numPr>
+        <w:rPr>
+          <w:lang w:val="es-PE"/>
+        </w:rPr>
+      </w:pPr>
       <w:hyperlink r:id="rId6" w:history="1">
         <w:r>
           <w:rPr>
@@ -6107,93 +6094,15 @@
         <w:rPr>
           <w:lang w:val="es-PE"/>
         </w:rPr>
-        <w:t xml:space="preserve"> </w:t>
-      </w:r>
-      <w:r>
-        <w:rPr>
-          <w:lang w:val="es-PE"/>
-        </w:rPr>
-        <w:t>aplicación bajo prueba.</w:t>
+        <w:t xml:space="preserve"> funcionalidades, roles, cuentas de ejemplo y tecnología.</w:t>
       </w:r>
     </w:p>
     <w:p>
       <w:pPr>
-        <w:pStyle w:val="Prrafodelista"/>
-        <w:numPr>
-          <w:ilvl w:val="0"/>
-          <w:numId w:val="13"/>
-        </w:numPr>
-        <w:rPr>
-          <w:lang w:val="es-PE"/>
-        </w:rPr>
-      </w:pPr>
-      <w:hyperlink r:id="rId7" w:history="1">
-        <w:r>
-          <w:rPr>
-            <w:rStyle w:val="Hipervnculo"/>
-            <w:lang w:val="es-PE"/>
-          </w:rPr>
-          <w:t>https://opensource-demo.orangehrmlive.com/web/index.php/auth/login</w:t>
-        </w:r>
-      </w:hyperlink>
-      <w:r>
-        <w:rPr>
-          <w:lang w:val="es-PE"/>
-        </w:rPr>
-        <w:t xml:space="preserve"> </w:t>
-      </w:r>
-      <w:r>
-        <w:rPr>
-          <w:lang w:val="es-PE"/>
-        </w:rPr>
-        <w:t>funcionalidades, roles, cuentas de ejemplo y tecnología.</w:t>
-      </w:r>
-    </w:p>
-    <w:p>
-      <w:pPr>
-        <w:pStyle w:val="Prrafodelista"/>
-        <w:numPr>
-          <w:ilvl w:val="0"/>
-          <w:numId w:val="13"/>
-        </w:numPr>
-        <w:rPr>
-          <w:lang w:val="es-PE"/>
-        </w:rPr>
-      </w:pPr>
-      <w:r>
-        <w:rPr>
-          <w:lang w:val="es-PE"/>
-        </w:rPr>
-        <w:t xml:space="preserve">Malla curricular del curso QA </w:t>
-      </w:r>
-      <w:proofErr w:type="spellStart"/>
-      <w:r>
-        <w:rPr>
-          <w:lang w:val="es-PE"/>
-        </w:rPr>
-        <w:t>Automatizador</w:t>
-      </w:r>
-      <w:proofErr w:type="spellEnd"/>
-      <w:r>
-        <w:rPr>
-          <w:lang w:val="es-PE"/>
-        </w:rPr>
-        <w:t xml:space="preserve"> (</w:t>
-      </w:r>
-      <w:proofErr w:type="spellStart"/>
-      <w:r>
-        <w:rPr>
-          <w:lang w:val="es-PE"/>
-        </w:rPr>
-        <w:t>Tecsup</w:t>
-      </w:r>
-      <w:proofErr w:type="spellEnd"/>
-      <w:r>
-        <w:rPr>
-          <w:lang w:val="es-PE"/>
-        </w:rPr>
-        <w:t xml:space="preserve"> Virtual): objetivos y entregables del Módulo 1.</w:t>
-      </w:r>
+        <w:rPr>
+          <w:lang w:val="es-PE"/>
+        </w:rPr>
+      </w:pPr>
     </w:p>
     <w:sectPr>
       <w:pgSz w:w="12240" w:h="15840"/>
@@ -7892,6 +7801,7 @@
   <w:style w:type="character" w:default="1" w:styleId="Fuentedeprrafopredeter">
     <w:name w:val="Default Paragraph Font"/>
     <w:uiPriority w:val="1"/>
+    <w:semiHidden/>
     <w:unhideWhenUsed/>
   </w:style>
   <w:style w:type="table" w:default="1" w:styleId="Tablanormal">

</xml_diff>